<commit_message>
Agrega documentacion tecnica final de HojaClara
</commit_message>
<xml_diff>
--- a/Doc y Bitácora/Bitácora...docx
+++ b/Doc y Bitácora/Bitácora...docx
@@ -25,28 +25,14 @@
         <w:jc w:val="both"/>
       </w:pPr>
       <w:r>
-        <w:rPr>
-          <w:b/>
-          <w:bCs/>
-        </w:rPr>
-        <w:t>Avance:</w:t>
-      </w:r>
-      <w:r>
-        <w:t xml:space="preserve"> Se realizó el análisis inicial del proyecto, los diagramas y pseudocódigos principales, y se completó el Nivel 1 generando una cuadrícula dinámica de 15 filas por 10 columnas con JavaScript.</w:t>
-      </w:r>
-    </w:p>
-    <w:p>
-      <w:pPr>
-        <w:spacing w:before="240" w:after="240"/>
-        <w:jc w:val="both"/>
-      </w:pPr>
-      <w:r>
-        <w:rPr>
-          <w:b/>
-          <w:bCs/>
-        </w:rPr>
-        <w:t>Problema:</w:t>
-      </w:r>
+        <w:t>Se realizó el análisis inicial del proyecto, los diagramas y pseudocódigos principales, y se completó el Nivel 1 generando una cuadrícula dinámica de 15 filas por 10 columnas con JavaScript.</w:t>
+      </w:r>
+    </w:p>
+    <w:p>
+      <w:pPr>
+        <w:spacing w:before="240" w:after="240"/>
+        <w:jc w:val="both"/>
+      </w:pPr>
       <w:r>
         <w:t xml:space="preserve"> El archivo </w:t>
       </w:r>
@@ -99,30 +85,16 @@
         <w:jc w:val="both"/>
       </w:pPr>
       <w:r>
-        <w:rPr>
-          <w:b/>
-          <w:bCs/>
-        </w:rPr>
-        <w:t>Avance:</w:t>
-      </w:r>
-      <w:r>
-        <w:t xml:space="preserve"> Se completó el Nivel 2, permitiendo editar celdas y guardar números o texto. También se avanzó en el Nivel 3, implementando fórmulas con suma, resta, multiplicación, división, precedencia y paréntesis.</w:t>
-      </w:r>
-    </w:p>
-    <w:p>
-      <w:pPr>
-        <w:spacing w:before="240" w:after="240"/>
-        <w:jc w:val="both"/>
-      </w:pPr>
-      <w:r>
-        <w:rPr>
-          <w:b/>
-          <w:bCs/>
-        </w:rPr>
-        <w:t>Problema:</w:t>
-      </w:r>
-      <w:r>
-        <w:t xml:space="preserve"> Durante las pruebas algunas fórmulas mostraban </w:t>
+        <w:t>Se completó el Nivel 2, permitiendo editar celdas y guardar números o texto. También se avanzó en el Nivel 3, implementando fórmulas con suma, resta, multiplicación, división, precedencia y paréntesis.</w:t>
+      </w:r>
+    </w:p>
+    <w:p>
+      <w:pPr>
+        <w:spacing w:before="240" w:after="240"/>
+        <w:jc w:val="both"/>
+      </w:pPr>
+      <w:r>
+        <w:t xml:space="preserve">Durante las pruebas algunas fórmulas mostraban </w:t>
       </w:r>
       <w:r>
         <w:rPr>
@@ -473,20 +445,6 @@
         <w:jc w:val="both"/>
       </w:pPr>
       <w:r>
-        <w:rPr>
-          <w:b/>
-          <w:bCs/>
-        </w:rPr>
-        <w:t>Avance:</w:t>
-      </w:r>
-      <w:r>
-        <w:rPr>
-          <w:b/>
-          <w:bCs/>
-        </w:rPr>
-        <w:br/>
-      </w:r>
-      <w:r>
         <w:t xml:space="preserve"> Se completaron los niveles 4 y 5 de </w:t>
       </w:r>
       <w:proofErr w:type="spellStart"/>
@@ -543,13 +501,6 @@
         <w:spacing w:before="240" w:after="240"/>
         <w:jc w:val="both"/>
       </w:pPr>
-      <w:r>
-        <w:rPr>
-          <w:b/>
-          <w:bCs/>
-        </w:rPr>
-        <w:t>Problema:</w:t>
-      </w:r>
       <w:r>
         <w:rPr>
           <w:b/>
@@ -937,7 +888,6 @@
     <w:p>
       <w:pPr>
         <w:spacing w:before="280"/>
-        <w:jc w:val="both"/>
         <w:rPr>
           <w:b/>
           <w:bCs/>
@@ -954,23 +904,12 @@
     </w:p>
     <w:p>
       <w:pPr>
-        <w:spacing w:before="240" w:after="240"/>
-        <w:jc w:val="both"/>
-      </w:pPr>
-      <w:r>
-        <w:rPr>
-          <w:b/>
-          <w:bCs/>
-        </w:rPr>
-        <w:t>Avance:</w:t>
-      </w:r>
-      <w:r>
-        <w:rPr>
-          <w:b/>
-          <w:bCs/>
-        </w:rPr>
-        <w:br/>
-      </w:r>
+        <w:spacing w:before="280"/>
+        <w:rPr>
+          <w:b/>
+          <w:bCs/>
+        </w:rPr>
+      </w:pPr>
       <w:r>
         <w:t xml:space="preserve"> Se reorganizó el código de </w:t>
       </w:r>
@@ -1213,13 +1152,6 @@
           <w:b/>
           <w:bCs/>
         </w:rPr>
-        <w:t>Problemas:</w:t>
-      </w:r>
-      <w:r>
-        <w:rPr>
-          <w:b/>
-          <w:bCs/>
-        </w:rPr>
         <w:br/>
       </w:r>
       <w:r>
@@ -1478,6 +1410,12 @@
         </w:rPr>
         <w:t>), que permite descargar el contenido de la hoja en un archivo compatible con Excel. Se realizaron ajustes para que los datos aparecieran separados por columnas y para que las fórmulas se exportaran como contenido original y no solamente como resultado. Con estas pruebas, el Nivel 7 quedó completado y funcionando correctamente.</w:t>
       </w:r>
+    </w:p>
+    <w:p>
+      <w:pPr>
+        <w:spacing w:before="240" w:after="240"/>
+        <w:jc w:val="both"/>
+      </w:pPr>
     </w:p>
     <w:p>
       <w:pPr>
@@ -1716,8 +1654,361 @@
         <w:jc w:val="both"/>
       </w:pPr>
     </w:p>
+    <w:p/>
+    <w:p/>
+    <w:p/>
+    <w:p/>
+    <w:p/>
+    <w:p/>
+    <w:p/>
+    <w:p/>
+    <w:p/>
+    <w:p/>
+    <w:p/>
+    <w:p/>
+    <w:p/>
+    <w:p/>
+    <w:p/>
+    <w:p/>
+    <w:p/>
+    <w:p/>
+    <w:p>
+      <w:pPr>
+        <w:tabs>
+          <w:tab w:val="left" w:pos="3036"/>
+        </w:tabs>
+      </w:pPr>
+      <w:r>
+        <w:tab/>
+      </w:r>
+    </w:p>
+    <w:p>
+      <w:pPr>
+        <w:tabs>
+          <w:tab w:val="left" w:pos="3036"/>
+        </w:tabs>
+      </w:pPr>
+    </w:p>
+    <w:p>
+      <w:pPr>
+        <w:tabs>
+          <w:tab w:val="left" w:pos="3036"/>
+        </w:tabs>
+      </w:pPr>
+    </w:p>
+    <w:p>
+      <w:pPr>
+        <w:tabs>
+          <w:tab w:val="left" w:pos="3036"/>
+        </w:tabs>
+      </w:pPr>
+    </w:p>
+    <w:p>
+      <w:pPr>
+        <w:tabs>
+          <w:tab w:val="left" w:pos="3036"/>
+        </w:tabs>
+        <w:jc w:val="both"/>
+        <w:rPr>
+          <w:b/>
+          <w:bCs/>
+        </w:rPr>
+      </w:pPr>
+      <w:r>
+        <w:rPr>
+          <w:b/>
+          <w:bCs/>
+        </w:rPr>
+        <w:lastRenderedPageBreak/>
+        <w:t>4 de septiembre</w:t>
+      </w:r>
+    </w:p>
+    <w:p>
+      <w:pPr>
+        <w:tabs>
+          <w:tab w:val="left" w:pos="3036"/>
+        </w:tabs>
+        <w:jc w:val="both"/>
+        <w:rPr>
+          <w:b/>
+          <w:bCs/>
+          <w:lang w:val="es-GT"/>
+        </w:rPr>
+      </w:pPr>
+    </w:p>
+    <w:p>
+      <w:pPr>
+        <w:tabs>
+          <w:tab w:val="left" w:pos="3036"/>
+        </w:tabs>
+        <w:jc w:val="both"/>
+        <w:rPr>
+          <w:lang w:val="es-GT"/>
+        </w:rPr>
+      </w:pPr>
+      <w:r>
+        <w:rPr>
+          <w:lang w:val="es-GT"/>
+        </w:rPr>
+        <w:t xml:space="preserve">Durante esta sesión se trabajó en los últimos ajustes del proyecto </w:t>
+      </w:r>
+      <w:proofErr w:type="spellStart"/>
+      <w:r>
+        <w:rPr>
+          <w:color w:val="9BBB59" w:themeColor="accent3"/>
+          <w:lang w:val="es-GT"/>
+        </w:rPr>
+        <w:t>HojaClara</w:t>
+      </w:r>
+      <w:proofErr w:type="spellEnd"/>
+      <w:r>
+        <w:rPr>
+          <w:lang w:val="es-GT"/>
+        </w:rPr>
+        <w:t xml:space="preserve">. Se mejoró la apariencia de la página, principalmente reduciendo el tamaño de las celdas para que la cuadrícula se viera más compacta y ordenada. También se ajustó la presentación de los botones y de los controles de formato, y se mejoró la forma en que se muestra la celda seleccionada utilizando </w:t>
+      </w:r>
+      <w:r>
+        <w:rPr>
+          <w:color w:val="4F81BD" w:themeColor="accent1"/>
+          <w:lang w:val="es-GT"/>
+        </w:rPr>
+        <w:t>CSS.</w:t>
+      </w:r>
+    </w:p>
+    <w:p>
+      <w:pPr>
+        <w:tabs>
+          <w:tab w:val="left" w:pos="3036"/>
+        </w:tabs>
+        <w:jc w:val="both"/>
+        <w:rPr>
+          <w:lang w:val="es-GT"/>
+        </w:rPr>
+      </w:pPr>
+    </w:p>
+    <w:p>
+      <w:pPr>
+        <w:tabs>
+          <w:tab w:val="left" w:pos="3036"/>
+        </w:tabs>
+        <w:jc w:val="both"/>
+        <w:rPr>
+          <w:lang w:val="es-GT"/>
+        </w:rPr>
+      </w:pPr>
+      <w:r>
+        <w:rPr>
+          <w:lang w:val="es-GT"/>
+        </w:rPr>
+        <w:t xml:space="preserve">Además, se revisó la publicación del proyecto en GitHub Pages. Al inicio, la dirección principal mostraba un error porque el archivo index.html se encuentra dentro de la carpeta </w:t>
+      </w:r>
+      <w:r>
+        <w:rPr>
+          <w:color w:val="000000" w:themeColor="text1"/>
+          <w:lang w:val="es-GT"/>
+        </w:rPr>
+        <w:t>CODIFICACIÓN</w:t>
+      </w:r>
+      <w:r>
+        <w:rPr>
+          <w:color w:val="4BACC6" w:themeColor="accent5"/>
+          <w:lang w:val="es-GT"/>
+        </w:rPr>
+        <w:t>.</w:t>
+      </w:r>
+      <w:r>
+        <w:rPr>
+          <w:lang w:val="es-GT"/>
+        </w:rPr>
+        <w:t xml:space="preserve"> Se comprobó que la aplicación funciona correctamente accediendo directamente a esa carpeta desde la dirección publicada, por lo que no fue necesario cambiar la estructura del proyecto.</w:t>
+      </w:r>
+    </w:p>
+    <w:p>
+      <w:pPr>
+        <w:tabs>
+          <w:tab w:val="left" w:pos="3036"/>
+        </w:tabs>
+        <w:jc w:val="both"/>
+        <w:rPr>
+          <w:lang w:val="es-GT"/>
+        </w:rPr>
+      </w:pPr>
+    </w:p>
+    <w:p>
+      <w:pPr>
+        <w:tabs>
+          <w:tab w:val="left" w:pos="3036"/>
+        </w:tabs>
+        <w:jc w:val="both"/>
+        <w:rPr>
+          <w:lang w:val="es-GT"/>
+        </w:rPr>
+      </w:pPr>
+      <w:r>
+        <w:rPr>
+          <w:lang w:val="es-GT"/>
+        </w:rPr>
+        <w:t>También se avanzó bastante en la documentación técnica. Se revisó y actualizó la explicación de la problemática para que coincidiera con las funciones finales del proyecto. Después se agregaron los diagramas de flujo realizados en PSeInt y se incorporaron los pseudocódigos correspondientes, mejorando su formato dentro del documento para que fueran más fáciles de leer.</w:t>
+      </w:r>
+    </w:p>
+    <w:p>
+      <w:pPr>
+        <w:tabs>
+          <w:tab w:val="left" w:pos="3036"/>
+        </w:tabs>
+        <w:jc w:val="both"/>
+        <w:rPr>
+          <w:lang w:val="es-GT"/>
+        </w:rPr>
+      </w:pPr>
+    </w:p>
+    <w:p>
+      <w:pPr>
+        <w:tabs>
+          <w:tab w:val="left" w:pos="3036"/>
+        </w:tabs>
+        <w:jc w:val="both"/>
+        <w:rPr>
+          <w:lang w:val="es-GT"/>
+        </w:rPr>
+      </w:pPr>
+      <w:r>
+        <w:rPr>
+          <w:lang w:val="es-GT"/>
+        </w:rPr>
+        <w:t xml:space="preserve">Se completó también la explicación de la estructura de datos utilizada en </w:t>
+      </w:r>
+      <w:proofErr w:type="spellStart"/>
+      <w:r>
+        <w:rPr>
+          <w:color w:val="9BBB59" w:themeColor="accent3"/>
+          <w:lang w:val="es-GT"/>
+        </w:rPr>
+        <w:t>HojaClara</w:t>
+      </w:r>
+      <w:proofErr w:type="spellEnd"/>
+      <w:r>
+        <w:rPr>
+          <w:lang w:val="es-GT"/>
+        </w:rPr>
+        <w:t>, indicando cómo se representa cada celda y cómo se manejan las dependencias entre ellas. Posteriormente, se redactó el manual de usuario, explicando de forma sencilla cómo ingresar datos, escribir fórmulas, utilizar funciones, aplicar formatos, navegar entre celdas, interpretar errores y exportar la hoja a CSV.</w:t>
+      </w:r>
+    </w:p>
+    <w:p>
+      <w:pPr>
+        <w:tabs>
+          <w:tab w:val="left" w:pos="3036"/>
+        </w:tabs>
+        <w:jc w:val="both"/>
+        <w:rPr>
+          <w:lang w:val="es-GT"/>
+        </w:rPr>
+      </w:pPr>
+    </w:p>
+    <w:p>
+      <w:pPr>
+        <w:tabs>
+          <w:tab w:val="left" w:pos="3036"/>
+        </w:tabs>
+        <w:jc w:val="both"/>
+        <w:rPr>
+          <w:lang w:val="es-GT"/>
+        </w:rPr>
+      </w:pPr>
+      <w:r>
+        <w:rPr>
+          <w:lang w:val="es-GT"/>
+        </w:rPr>
+        <w:t xml:space="preserve">Finalmente, se agregó al manual la forma de utilizar </w:t>
+      </w:r>
+      <w:proofErr w:type="spellStart"/>
+      <w:r>
+        <w:rPr>
+          <w:color w:val="9BBB59" w:themeColor="accent3"/>
+          <w:lang w:val="es-GT"/>
+        </w:rPr>
+        <w:t>HojaClara</w:t>
+      </w:r>
+      <w:proofErr w:type="spellEnd"/>
+      <w:r>
+        <w:rPr>
+          <w:lang w:val="es-GT"/>
+        </w:rPr>
+        <w:t xml:space="preserve"> sin conexión a Internet, abriendo directamente el archivo index.html desde la carpeta del proyecto. Con estos avances, el proyecto quedó funcional, publicado y con la mayor parte de la documentación final completada.</w:t>
+      </w:r>
+    </w:p>
+    <w:p>
+      <w:pPr>
+        <w:tabs>
+          <w:tab w:val="left" w:pos="3036"/>
+        </w:tabs>
+        <w:rPr>
+          <w:lang w:val="es-GT"/>
+        </w:rPr>
+      </w:pPr>
+      <w:r>
+        <w:rPr>
+          <w:lang w:val="es-GT"/>
+        </w:rPr>
+        <w:drawing>
+          <wp:anchor distT="0" distB="0" distL="114300" distR="114300" simplePos="0" relativeHeight="251664384" behindDoc="0" locked="0" layoutInCell="1" allowOverlap="1" wp14:anchorId="5DB9F0CE" wp14:editId="30A062DF">
+            <wp:simplePos x="0" y="0"/>
+            <wp:positionH relativeFrom="column">
+              <wp:posOffset>894715</wp:posOffset>
+            </wp:positionH>
+            <wp:positionV relativeFrom="paragraph">
+              <wp:posOffset>353060</wp:posOffset>
+            </wp:positionV>
+            <wp:extent cx="3718560" cy="3164215"/>
+            <wp:effectExtent l="0" t="0" r="0" b="0"/>
+            <wp:wrapNone/>
+            <wp:docPr id="134446999" name="Imagen 1"/>
+            <wp:cNvGraphicFramePr>
+              <a:graphicFrameLocks xmlns:a="http://schemas.openxmlformats.org/drawingml/2006/main" noChangeAspect="1"/>
+            </wp:cNvGraphicFramePr>
+            <a:graphic xmlns:a="http://schemas.openxmlformats.org/drawingml/2006/main">
+              <a:graphicData uri="http://schemas.openxmlformats.org/drawingml/2006/picture">
+                <pic:pic xmlns:pic="http://schemas.openxmlformats.org/drawingml/2006/picture">
+                  <pic:nvPicPr>
+                    <pic:cNvPr id="134446999" name=""/>
+                    <pic:cNvPicPr/>
+                  </pic:nvPicPr>
+                  <pic:blipFill>
+                    <a:blip r:embed="rId11" cstate="print">
+                      <a:extLst>
+                        <a:ext uri="{28A0092B-C50C-407E-A947-70E740481C1C}">
+                          <a14:useLocalDpi xmlns:a14="http://schemas.microsoft.com/office/drawing/2010/main" val="0"/>
+                        </a:ext>
+                      </a:extLst>
+                    </a:blip>
+                    <a:stretch>
+                      <a:fillRect/>
+                    </a:stretch>
+                  </pic:blipFill>
+                  <pic:spPr>
+                    <a:xfrm>
+                      <a:off x="0" y="0"/>
+                      <a:ext cx="3718560" cy="3164215"/>
+                    </a:xfrm>
+                    <a:prstGeom prst="rect">
+                      <a:avLst/>
+                    </a:prstGeom>
+                  </pic:spPr>
+                </pic:pic>
+              </a:graphicData>
+            </a:graphic>
+            <wp14:sizeRelH relativeFrom="margin">
+              <wp14:pctWidth>0</wp14:pctWidth>
+            </wp14:sizeRelH>
+            <wp14:sizeRelV relativeFrom="margin">
+              <wp14:pctHeight>0</wp14:pctHeight>
+            </wp14:sizeRelV>
+          </wp:anchor>
+        </w:drawing>
+      </w:r>
+    </w:p>
     <w:sectPr>
-      <w:footerReference w:type="default" r:id="rId11"/>
+      <w:footerReference w:type="default" r:id="rId12"/>
       <w:pgSz w:w="11909" w:h="16834"/>
       <w:pgMar w:top="1440" w:right="1440" w:bottom="1440" w:left="1440" w:header="720" w:footer="720" w:gutter="0"/>
       <w:pgNumType w:start="1"/>

</xml_diff>